<commit_message>
Fill Tatarak giant path features
</commit_message>
<xml_diff>
--- a/Essentials/Tatarak.docx
+++ b/Essentials/Tatarak.docx
@@ -431,7 +431,7 @@
           <w:color w:val="2D1F15"/>
           <w:sz w:val="23"/>
         </w:rPr>
-        <w:t>The chosen path grants features at 3rd level and again at 6th, 10th, and 14th levels.</w:t>
+        <w:t>Tatarak follows the Path of the Giant, drawing on giant-like strength while raging.</w:t>
       </w:r>
     </w:p>
     <w:p>
@@ -448,7 +448,197 @@
           <w:color w:val="2D1F15"/>
           <w:sz w:val="23"/>
         </w:rPr>
-        <w:t>Tatarak has Path of the Giant written on his character sheet, but the exact Path of the Giant feature text was not present on the provided Barbarian page.</w:t>
+        <w:t>This path gives him 3rd-level giant features now and later path features at higher barbarian levels.</w:t>
+      </w:r>
+    </w:p>
+    <w:p>
+      <w:pPr>
+        <w:spacing w:before="260" w:after="80"/>
+        <w:pBdr>
+          <w:bottom w:val="single" w:sz="8" w:space="6" w:color="7A4A22"/>
+        </w:pBdr>
+      </w:pPr>
+      <w:r>
+        <w:rPr>
+          <w:rFonts w:ascii="Garamond" w:hAnsi="Garamond"/>
+          <w:b/>
+          <w:i w:val="0"/>
+          <w:color w:val="5C3114"/>
+          <w:sz w:val="32"/>
+        </w:rPr>
+        <w:t>Primal Knowledge</w:t>
+      </w:r>
+    </w:p>
+    <w:p>
+      <w:pPr>
+        <w:pStyle w:val="ListBullet"/>
+        <w:spacing w:after="60"/>
+        <w:ind w:left="360"/>
+      </w:pPr>
+      <w:r>
+        <w:rPr>
+          <w:rFonts w:ascii="Garamond" w:hAnsi="Garamond"/>
+          <w:b w:val="0"/>
+          <w:i w:val="0"/>
+          <w:color w:val="2D1F15"/>
+          <w:sz w:val="23"/>
+        </w:rPr>
+        <w:t>At 3rd level, Tatarak gains proficiency in one skill of his choice from the barbarian skill list.</w:t>
+      </w:r>
+    </w:p>
+    <w:p>
+      <w:pPr>
+        <w:pStyle w:val="ListBullet"/>
+        <w:spacing w:after="60"/>
+        <w:ind w:left="360"/>
+      </w:pPr>
+      <w:r>
+        <w:rPr>
+          <w:rFonts w:ascii="Garamond" w:hAnsi="Garamond"/>
+          <w:b w:val="0"/>
+          <w:i w:val="0"/>
+          <w:color w:val="2D1F15"/>
+          <w:sz w:val="23"/>
+        </w:rPr>
+        <w:t>The barbarian skill list is Animal Handling, Athletics, Intimidation, Nature, Perception, and Survival.</w:t>
+      </w:r>
+    </w:p>
+    <w:p>
+      <w:pPr>
+        <w:pStyle w:val="ListBullet"/>
+        <w:spacing w:after="60"/>
+        <w:ind w:left="360"/>
+      </w:pPr>
+      <w:r>
+        <w:rPr>
+          <w:rFonts w:ascii="Garamond" w:hAnsi="Garamond"/>
+          <w:b w:val="0"/>
+          <w:i w:val="0"/>
+          <w:color w:val="2D1F15"/>
+          <w:sz w:val="23"/>
+        </w:rPr>
+        <w:t>The feature appears again at 10th level for another skill proficiency from the same list.</w:t>
+      </w:r>
+    </w:p>
+    <w:p>
+      <w:pPr>
+        <w:spacing w:before="260" w:after="80"/>
+        <w:pBdr>
+          <w:bottom w:val="single" w:sz="8" w:space="6" w:color="7A4A22"/>
+        </w:pBdr>
+      </w:pPr>
+      <w:r>
+        <w:rPr>
+          <w:rFonts w:ascii="Garamond" w:hAnsi="Garamond"/>
+          <w:b/>
+          <w:i w:val="0"/>
+          <w:color w:val="5C3114"/>
+          <w:sz w:val="32"/>
+        </w:rPr>
+        <w:t>Crushing Throw</w:t>
+      </w:r>
+    </w:p>
+    <w:p>
+      <w:pPr>
+        <w:pStyle w:val="ListBullet"/>
+        <w:spacing w:after="60"/>
+        <w:ind w:left="360"/>
+      </w:pPr>
+      <w:r>
+        <w:rPr>
+          <w:rFonts w:ascii="Garamond" w:hAnsi="Garamond"/>
+          <w:b w:val="0"/>
+          <w:i w:val="0"/>
+          <w:color w:val="2D1F15"/>
+          <w:sz w:val="23"/>
+        </w:rPr>
+        <w:t>While raging, Tatarak can add his Rage Damage bonus to a successful ranged attack made with a thrown weapon using Strength.</w:t>
+      </w:r>
+    </w:p>
+    <w:p>
+      <w:pPr>
+        <w:pStyle w:val="ListBullet"/>
+        <w:spacing w:after="60"/>
+        <w:ind w:left="360"/>
+      </w:pPr>
+      <w:r>
+        <w:rPr>
+          <w:rFonts w:ascii="Garamond" w:hAnsi="Garamond"/>
+          <w:b w:val="0"/>
+          <w:i w:val="0"/>
+          <w:color w:val="2D1F15"/>
+          <w:sz w:val="23"/>
+        </w:rPr>
+        <w:t>At barbarian level 4, that bonus is +2 damage.</w:t>
+      </w:r>
+    </w:p>
+    <w:p>
+      <w:pPr>
+        <w:spacing w:before="260" w:after="80"/>
+        <w:pBdr>
+          <w:bottom w:val="single" w:sz="8" w:space="6" w:color="7A4A22"/>
+        </w:pBdr>
+      </w:pPr>
+      <w:r>
+        <w:rPr>
+          <w:rFonts w:ascii="Garamond" w:hAnsi="Garamond"/>
+          <w:b/>
+          <w:i w:val="0"/>
+          <w:color w:val="5C3114"/>
+          <w:sz w:val="32"/>
+        </w:rPr>
+        <w:t>Giant Stature</w:t>
+      </w:r>
+    </w:p>
+    <w:p>
+      <w:pPr>
+        <w:pStyle w:val="ListBullet"/>
+        <w:spacing w:after="60"/>
+        <w:ind w:left="360"/>
+      </w:pPr>
+      <w:r>
+        <w:rPr>
+          <w:rFonts w:ascii="Garamond" w:hAnsi="Garamond"/>
+          <w:b w:val="0"/>
+          <w:i w:val="0"/>
+          <w:color w:val="2D1F15"/>
+          <w:sz w:val="23"/>
+        </w:rPr>
+        <w:t>While raging, Tatarak?s reach increases by 5 feet.</w:t>
+      </w:r>
+    </w:p>
+    <w:p>
+      <w:pPr>
+        <w:pStyle w:val="ListBullet"/>
+        <w:spacing w:after="60"/>
+        <w:ind w:left="360"/>
+      </w:pPr>
+      <w:r>
+        <w:rPr>
+          <w:rFonts w:ascii="Garamond" w:hAnsi="Garamond"/>
+          <w:b w:val="0"/>
+          <w:i w:val="0"/>
+          <w:color w:val="2D1F15"/>
+          <w:sz w:val="23"/>
+        </w:rPr>
+        <w:t>If he is smaller than Large, he becomes Large along with anything he is wearing.</w:t>
+      </w:r>
+    </w:p>
+    <w:p>
+      <w:pPr>
+        <w:pStyle w:val="ListBullet"/>
+        <w:spacing w:after="60"/>
+        <w:ind w:left="360"/>
+      </w:pPr>
+      <w:r>
+        <w:rPr>
+          <w:rFonts w:ascii="Garamond" w:hAnsi="Garamond"/>
+          <w:b w:val="0"/>
+          <w:i w:val="0"/>
+          <w:color w:val="2D1F15"/>
+          <w:sz w:val="23"/>
+        </w:rPr>
+        <w:t>If there is not enough room for his size to increase, his size does not change.</w:t>
       </w:r>
     </w:p>
     <w:p>
@@ -639,90 +829,6 @@
           <w:sz w:val="23"/>
         </w:rPr>
         <w:t>He is acclimated to high altitude, including elevations above 20,000 feet.</w:t>
-      </w:r>
-    </w:p>
-    <w:p>
-      <w:pPr>
-        <w:spacing w:before="260" w:after="80"/>
-        <w:pBdr>
-          <w:bottom w:val="single" w:sz="8" w:space="6" w:color="7A4A22"/>
-        </w:pBdr>
-      </w:pPr>
-      <w:r>
-        <w:rPr>
-          <w:rFonts w:ascii="Garamond" w:hAnsi="Garamond"/>
-          <w:b/>
-          <w:i w:val="0"/>
-          <w:color w:val="5C3114"/>
-          <w:sz w:val="32"/>
-        </w:rPr>
-        <w:t>Missing From the Provided Sources</w:t>
-      </w:r>
-    </w:p>
-    <w:p>
-      <w:pPr>
-        <w:spacing w:after="100"/>
-      </w:pPr>
-      <w:r>
-        <w:rPr>
-          <w:rFonts w:ascii="Garamond" w:hAnsi="Garamond"/>
-          <w:b w:val="0"/>
-          <w:i w:val="0"/>
-          <w:color w:val="2D1F15"/>
-          <w:sz w:val="23"/>
-        </w:rPr>
-        <w:t>These traits are written in Tatarak's PDF, but their full rules text was not present on the provided Barbarian page or the provided Goliath species pages.</w:t>
-      </w:r>
-    </w:p>
-    <w:p>
-      <w:pPr>
-        <w:pStyle w:val="ListBullet"/>
-        <w:spacing w:after="60"/>
-        <w:ind w:left="360"/>
-      </w:pPr>
-      <w:r>
-        <w:rPr>
-          <w:rFonts w:ascii="Garamond" w:hAnsi="Garamond"/>
-          <w:b w:val="0"/>
-          <w:i w:val="0"/>
-          <w:color w:val="2D1F15"/>
-          <w:sz w:val="23"/>
-        </w:rPr>
-        <w:t>Primal Knowledge</w:t>
-      </w:r>
-    </w:p>
-    <w:p>
-      <w:pPr>
-        <w:pStyle w:val="ListBullet"/>
-        <w:spacing w:after="60"/>
-        <w:ind w:left="360"/>
-      </w:pPr>
-      <w:r>
-        <w:rPr>
-          <w:rFonts w:ascii="Garamond" w:hAnsi="Garamond"/>
-          <w:b w:val="0"/>
-          <w:i w:val="0"/>
-          <w:color w:val="2D1F15"/>
-          <w:sz w:val="23"/>
-        </w:rPr>
-        <w:t>Crushing Throw</w:t>
-      </w:r>
-    </w:p>
-    <w:p>
-      <w:pPr>
-        <w:pStyle w:val="ListBullet"/>
-        <w:spacing w:after="60"/>
-        <w:ind w:left="360"/>
-      </w:pPr>
-      <w:r>
-        <w:rPr>
-          <w:rFonts w:ascii="Garamond" w:hAnsi="Garamond"/>
-          <w:b w:val="0"/>
-          <w:i w:val="0"/>
-          <w:color w:val="2D1F15"/>
-          <w:sz w:val="23"/>
-        </w:rPr>
-        <w:t>Giant Stature</w:t>
       </w:r>
     </w:p>
     <w:sectPr>

</xml_diff>